<commit_message>
fix: transporte de residuos sem repetir quantidade (so primeira linha da classe preenchida)
</commit_message>
<xml_diff>
--- a/src/lib/templates/pgrcc-iat/template.docx
+++ b/src/lib/templates/pgrcc-iat/template.docx
@@ -17195,7 +17195,7 @@
                 <w:szCs w:val="16"/>
                 <w:lang w:val="pt-BR"/>
               </w:rPr>
-              <w:t>[transp_quant_solo]</w:t>
+              <w:t>[transp_quant_solo_2]</w:t>
             </w:r>
           </w:p>
         </w:tc>
@@ -17304,7 +17304,7 @@
                 <w:szCs w:val="16"/>
                 <w:lang w:val="pt-BR"/>
               </w:rPr>
-              <w:t>[transp_quant_solo]</w:t>
+              <w:t>[transp_quant_solo_3]</w:t>
             </w:r>
           </w:p>
         </w:tc>
@@ -17528,7 +17528,7 @@
                 <w:sz w:val="16"/>
                 <w:szCs w:val="16"/>
               </w:rPr>
-              <w:t>[transp_quant_exceto_solo]</w:t>
+              <w:t>[transp_quant_exceto_solo_2]</w:t>
             </w:r>
           </w:p>
         </w:tc>
@@ -17758,7 +17758,7 @@
                 <w:szCs w:val="16"/>
                 <w:lang w:val="pt-BR"/>
               </w:rPr>
-              <w:t>[transp_quant_b]</w:t>
+              <w:t>[transp_quant_b_2]</w:t>
             </w:r>
           </w:p>
         </w:tc>
@@ -17868,7 +17868,7 @@
                 <w:szCs w:val="16"/>
                 <w:lang w:val="pt-BR"/>
               </w:rPr>
-              <w:t>[transp_quant_b]</w:t>
+              <w:t>[transp_quant_b_3]</w:t>
             </w:r>
           </w:p>
         </w:tc>
@@ -18112,7 +18112,7 @@
                 <w:szCs w:val="16"/>
                 <w:lang w:val="pt-BR"/>
               </w:rPr>
-              <w:t>[transp_quant_c]</w:t>
+              <w:t>[transp_quant_c_2]</w:t>
             </w:r>
           </w:p>
         </w:tc>
@@ -18354,7 +18354,7 @@
                 <w:szCs w:val="16"/>
                 <w:lang w:val="pt-BR"/>
               </w:rPr>
-              <w:t>[transp_quant_d]</w:t>
+              <w:t>[transp_quant_d_2]</w:t>
             </w:r>
           </w:p>
         </w:tc>

</xml_diff>